<commit_message>
Move the activity conditions onto gateways and make the late-slot branch drivable
core-2: add N_CL_ChargeImpactDecision after N_CL_ModifyTreatment. affectsCharge=true takes F41 to the finance review; the default F56 ends the path without it, so the condition is a guard rather than intent (DEF-14).

core-4: N_CNS_PathwayReview now feeds N_CNS_PathwayDecision (F19 continue, F21 close, default F20 inform the referrer), so the three outcomes are exclusive. The redundant N_F_PaidAffected gateway and its unreachable F24 are removed; F17 goes straight to N_F_RetentionDecision.

core-1: appointment-availability accepts the optional slotLeadDays scenario value, so the two-week safety net (F30) can be driven without changing the configured routine and urgent lead times.

Re-exported core-2 and core-4 PDF/PNG; updated the requirements, plan evaluation, feedback record, demonstration script, test plan and strategic references, and re-rendered both docx exports.
</commit_message>
<xml_diff>
--- a/docs/planning/exports/plan-evaluation.docx
+++ b/docs/planning/exports/plan-evaluation.docx
@@ -2074,7 +2074,7 @@
                 <w:rFonts w:ascii="Consolas" w:hAnsi="Consolas"/>
                 <w:sz w:val="17"/>
               </w:rPr>
-              <w:t>F41</w:t>
+              <w:t>N_CL_ChargeImpactDecision</w:t>
             </w:r>
             <w:r>
               <w:rPr>
@@ -2093,7 +2093,33 @@
               <w:rPr>
                 <w:sz w:val="16"/>
               </w:rPr>
-              <w:t>, which is right. The interaction with the urgent path (</w:t>
+              <w:t xml:space="preserve"> (</w:t>
+            </w:r>
+            <w:r>
+              <w:rPr>
+                <w:rFonts w:ascii="Consolas" w:hAnsi="Consolas"/>
+                <w:sz w:val="17"/>
+              </w:rPr>
+              <w:t>F41</w:t>
+            </w:r>
+            <w:r>
+              <w:rPr>
+                <w:sz w:val="16"/>
+              </w:rPr>
+              <w:t>) and skips the review when the charge is unaffected (</w:t>
+            </w:r>
+            <w:r>
+              <w:rPr>
+                <w:rFonts w:ascii="Consolas" w:hAnsi="Consolas"/>
+                <w:sz w:val="17"/>
+              </w:rPr>
+              <w:t>F56</w:t>
+            </w:r>
+            <w:r>
+              <w:rPr>
+                <w:sz w:val="16"/>
+              </w:rPr>
+              <w:t>), which is right. The interaction with the urgent path (</w:t>
             </w:r>
             <w:r>
               <w:rPr>
@@ -2194,13 +2220,13 @@
                 <w:rFonts w:ascii="Consolas" w:hAnsi="Consolas"/>
                 <w:sz w:val="17"/>
               </w:rPr>
-              <w:t>N_F_PaidAffected</w:t>
-            </w:r>
-            <w:r>
-              <w:rPr>
-                <w:sz w:val="16"/>
-              </w:rPr>
-              <w:t xml:space="preserve">, </w:t>
+              <w:t>N_OB_AnotherAppointment</w:t>
+            </w:r>
+            <w:r>
+              <w:rPr>
+                <w:sz w:val="16"/>
+              </w:rPr>
+              <w:t xml:space="preserve"> (F17), </w:t>
             </w:r>
             <w:r>
               <w:rPr>
@@ -2394,7 +2420,7 @@
               <w:rPr>
                 <w:sz w:val="16"/>
               </w:rPr>
-              <w:t>, so no clinical or administrative lane owns the decision. The branch is guarded twice (</w:t>
+              <w:t xml:space="preserve">, so no clinical or administrative lane owns the decision. The branch is guarded once, by </w:t>
             </w:r>
             <w:r>
               <w:rPr>
@@ -2420,20 +2446,20 @@
               <w:rPr>
                 <w:sz w:val="16"/>
               </w:rPr>
-              <w:t xml:space="preserve">, and </w:t>
+              <w:t xml:space="preserve">; the separate </w:t>
             </w:r>
             <w:r>
               <w:rPr>
                 <w:rFonts w:ascii="Consolas" w:hAnsi="Consolas"/>
                 <w:sz w:val="17"/>
               </w:rPr>
-              <w:t>F23</w:t>
-            </w:r>
-            <w:r>
-              <w:rPr>
-                <w:sz w:val="16"/>
-              </w:rPr>
-              <w:t xml:space="preserve"> testing the same variable again), the refund is made only against a payment the same run settled with the provider, and the refund worker refuses a payment that was never settled. </w:t>
+              <w:t>N_F_PaidAffected</w:t>
+            </w:r>
+            <w:r>
+              <w:rPr>
+                <w:sz w:val="16"/>
+              </w:rPr>
+              <w:t xml:space="preserve"> gateway that tested the same variable twice was removed on 2026-10-19, the refund is made only against a payment the same run settled with the provider, and the refund worker refuses a payment that was never settled. </w:t>
             </w:r>
             <w:r>
               <w:rPr>
@@ -5766,7 +5792,7 @@
         <w:t>DEF-14</w:t>
       </w:r>
       <w:r>
-        <w:t xml:space="preserve">). One of them, </w:t>
+        <w:t xml:space="preserve">). Both now decide at gateways and both answers have been driven: </w:t>
       </w:r>
       <w:r>
         <w:rPr>
@@ -5776,7 +5802,17 @@
         <w:t>retryPayment</w:t>
       </w:r>
       <w:r>
-        <w:t xml:space="preserve">, now decides at a gateway and both answers have been driven; the other, </w:t>
+        <w:t xml:space="preserve"> at </w:t>
+      </w:r>
+      <w:r>
+        <w:rPr>
+          <w:rFonts w:ascii="Consolas" w:hAnsi="Consolas"/>
+          <w:sz w:val="17"/>
+        </w:rPr>
+        <w:t>N_F_RetryDecision</w:t>
+      </w:r>
+      <w:r>
+        <w:t xml:space="preserve">, and </w:t>
       </w:r>
       <w:r>
         <w:rPr>
@@ -5786,7 +5822,37 @@
         <w:t>affectsCharge</w:t>
       </w:r>
       <w:r>
-        <w:t>, is corrected but still not enforced. The conditions out of gateways - which is every decision this evaluation checked - are unaffected.</w:t>
+        <w:t xml:space="preserve"> at </w:t>
+      </w:r>
+      <w:r>
+        <w:rPr>
+          <w:rFonts w:ascii="Consolas" w:hAnsi="Consolas"/>
+          <w:sz w:val="17"/>
+        </w:rPr>
+        <w:t>N_CL_ChargeImpactDecision</w:t>
+      </w:r>
+      <w:r>
+        <w:t xml:space="preserve"> (</w:t>
+      </w:r>
+      <w:r>
+        <w:rPr>
+          <w:rFonts w:ascii="Consolas" w:hAnsi="Consolas"/>
+          <w:sz w:val="17"/>
+        </w:rPr>
+        <w:t>F41</w:t>
+      </w:r>
+      <w:r>
+        <w:t xml:space="preserve"> review / </w:t>
+      </w:r>
+      <w:r>
+        <w:rPr>
+          <w:rFonts w:ascii="Consolas" w:hAnsi="Consolas"/>
+          <w:sz w:val="17"/>
+        </w:rPr>
+        <w:t>F56</w:t>
+      </w:r>
+      <w:r>
+        <w:t xml:space="preserve"> no review, added on 2026-10-19). No executable model now carries a condition on an activity's only outgoing flow. The conditions out of gateways - which is every decision this evaluation checked - are unaffected.</w:t>
       </w:r>
     </w:p>
     <w:p>

</xml_diff>